<commit_message>
Update changelog and Software Architect resume: rebalance resume layout by removing duplicate highlights and unsupported content, and enhance clarity.
</commit_message>
<xml_diff>
--- a/resumes/software-architect/resume.docx
+++ b/resumes/software-architect/resume.docx
@@ -125,39 +125,7 @@
         <w:t xml:space="preserve">•  </w:t>
       </w:r>
       <w:r>
-        <w:t>Helped support an internal election-management platform used by 50,000 users alongside a public-facing application.</w:t>
-      </w:r>
-    </w:p>
-    <w:p>
-      <w:pPr>
-        <w:spacing w:after="36" w:line="245" w:lineRule="auto"/>
-        <w:ind w:left="245" w:hanging="187"/>
-        <w:keepLines/>
-      </w:pPr>
-      <w:r>
-        <w:rPr>
-          <w:color w:val="1B375C"/>
-        </w:rPr>
-        <w:t xml:space="preserve">•  </w:t>
-      </w:r>
-      <w:r>
         <w:t>Designed the database schema for an exam-management platform and improved response time by 30% through Redis caching and backend optimization.</w:t>
-      </w:r>
-    </w:p>
-    <w:p>
-      <w:pPr>
-        <w:spacing w:after="36" w:line="245" w:lineRule="auto"/>
-        <w:ind w:left="245" w:hanging="187"/>
-        <w:keepLines/>
-      </w:pPr>
-      <w:r>
-        <w:rPr>
-          <w:color w:val="1B375C"/>
-        </w:rPr>
-        <w:t xml:space="preserve">•  </w:t>
-      </w:r>
-      <w:r>
-        <w:t>Contributed to National Electronic Government Procurement System workflows involving relational data, large-file handling, privacy, and integrity.</w:t>
       </w:r>
     </w:p>
     <w:p>
@@ -283,22 +251,6 @@
       </w:pPr>
       <w:r>
         <w:t>Dhaka, Bangladesh | August 2023 - Present</w:t>
-      </w:r>
-    </w:p>
-    <w:p>
-      <w:pPr>
-        <w:spacing w:after="36" w:line="245" w:lineRule="auto"/>
-        <w:ind w:left="245" w:hanging="187"/>
-        <w:keepLines/>
-      </w:pPr>
-      <w:r>
-        <w:rPr>
-          <w:color w:val="1B375C"/>
-        </w:rPr>
-        <w:t xml:space="preserve">•  </w:t>
-      </w:r>
-      <w:r>
-        <w:t>Key technologies: Java, Spring Boot, Hibernate, REST APIs, Docker, Kubernetes, Keycloak.</w:t>
       </w:r>
     </w:p>
     <w:p>
@@ -513,41 +465,6 @@
       </w:r>
       <w:r>
         <w:t>Collaborated with stakeholders, customers, and product teams through iterative, agile delivery practices.</w:t>
-      </w:r>
-    </w:p>
-    <w:p>
-      <w:pPr>
-        <w:pStyle w:val="DesignedSubsection"/>
-        <w:spacing w:before="90" w:after="10"/>
-        <w:keepNext/>
-      </w:pPr>
-      <w:r>
-        <w:t>Jaliks Soft IT Limited - .NET Developer</w:t>
-      </w:r>
-    </w:p>
-    <w:p>
-      <w:pPr>
-        <w:spacing w:after="40"/>
-        <w:keepLines/>
-      </w:pPr>
-      <w:r>
-        <w:t>Khulna, Bangladesh | February 2016 - June 2016</w:t>
-      </w:r>
-    </w:p>
-    <w:p>
-      <w:pPr>
-        <w:spacing w:after="36" w:line="245" w:lineRule="auto"/>
-        <w:ind w:left="245" w:hanging="187"/>
-        <w:keepLines/>
-      </w:pPr>
-      <w:r>
-        <w:rPr>
-          <w:color w:val="1B375C"/>
-        </w:rPr>
-        <w:t xml:space="preserve">•  </w:t>
-      </w:r>
-      <w:r>
-        <w:t>Implemented features and resolved defects for a large-scale education application using ASP.NET, C#, and SQL Server.</w:t>
       </w:r>
     </w:p>
     <w:p>

</xml_diff>